<commit_message>
new chap 4 ending
</commit_message>
<xml_diff>
--- a/chapters/GTIchap4.docx
+++ b/chapters/GTIchap4.docx
@@ -2128,7 +2128,7 @@
           <w:szCs w:val="28"/>
           <w:rtl w:val="0"/>
         </w:rPr>
-        <w:t xml:space="preserve">“You know…” said Glory, slowly, Brynn standing beside her on the balcony of the tower as the pair watched Bore’Van carving his lonesome footsteps into the sand, tracing the coastline and heading for the warm air of the south. “It was this place that started it all, the war that killed Kasseia…”</w:t>
+        <w:t xml:space="preserve">“You know…” said Glory, slowly, Brynn standing beside her on the balcony of the tower as the pair watched Bore’Van carrying his hefty bag from the foot of the tower to drop it beside the jetty where the Sorceress waited quietly for him. “It was this place that started it all, the war that killed Kasseia…” </w:t>
       </w:r>
     </w:p>
     <w:p>
@@ -2170,28 +2170,50 @@
           <w:szCs w:val="28"/>
           <w:rtl w:val="0"/>
         </w:rPr>
-        <w:t xml:space="preserve">“Mmm hmm,” she said, nodding her head. “See, we call it a lighthouse, but it’s actually an echo tower. They used it for navigation, they’d hit a big bloody sheet of metal up there, every night. The noise of this one, and the other hundred, pissed everyone off, and so… yeah, that’s why Anoleth went to war with them,” she said, looking up at his curious expression with some satisfaction. “This is the last one standing, they thought they could make a lighthouse of it, but the light didn’t reach the fort, so… here it stands abandoned.” </w:t>
-      </w:r>
-    </w:p>
-    <w:p>
-      <w:pPr>
-        <w:ind w:left="0" w:firstLine="720"/>
-        <w:rPr>
-          <w:rFonts w:ascii="Montserrat" w:cs="Montserrat" w:eastAsia="Montserrat" w:hAnsi="Montserrat"/>
-          <w:color w:val="ffffff"/>
-          <w:sz w:val="28"/>
-          <w:szCs w:val="28"/>
-        </w:rPr>
-      </w:pPr>
-      <w:r>
-        <w:rPr>
-          <w:rFonts w:ascii="Montserrat" w:cs="Montserrat" w:eastAsia="Montserrat" w:hAnsi="Montserrat"/>
-          <w:color w:val="ffffff"/>
-          <w:sz w:val="28"/>
-          <w:szCs w:val="28"/>
-          <w:rtl w:val="0"/>
-        </w:rPr>
-        <w:t xml:space="preserve">“That’s totally crazy…” he said, his gruff accent leaning into a slight chuckle. “I thought it was over land, or something…”</w:t>
+        <w:t xml:space="preserve">“Mmm hmm,” she said, nodding her head. “See, we call it a lighthouse, but it’s actually an </w:t>
+      </w:r>
+      <w:r>
+        <w:rPr>
+          <w:rFonts w:ascii="Montserrat" w:cs="Montserrat" w:eastAsia="Montserrat" w:hAnsi="Montserrat"/>
+          <w:i w:val="1"/>
+          <w:iCs w:val="1"/>
+          <w:color w:val="ffffff"/>
+          <w:sz w:val="28"/>
+          <w:szCs w:val="28"/>
+          <w:rtl w:val="0"/>
+        </w:rPr>
+        <w:t xml:space="preserve">echo tower</w:t>
+      </w:r>
+      <w:r>
+        <w:rPr>
+          <w:rFonts w:ascii="Montserrat" w:cs="Montserrat" w:eastAsia="Montserrat" w:hAnsi="Montserrat"/>
+          <w:color w:val="ffffff"/>
+          <w:sz w:val="28"/>
+          <w:szCs w:val="28"/>
+          <w:rtl w:val="0"/>
+        </w:rPr>
+        <w:t xml:space="preserve">. They used it for navigation, they’d hit a big bloody sheet of metal up there, every night. The noise of this one, and the other hundred, pissed everyone off, and so… yeah, that’s why Anoleth went to war with them,” she said, looking up at his curious expression with some satisfaction. “This is the last one standing, they thought they could make a lighthouse of it, but the light didn’t reach the cliffs over there, so… here it stands abandoned.” </w:t>
+      </w:r>
+    </w:p>
+    <w:p>
+      <w:pPr>
+        <w:ind w:left="0" w:firstLine="720"/>
+        <w:rPr>
+          <w:rFonts w:ascii="Montserrat" w:cs="Montserrat" w:eastAsia="Montserrat" w:hAnsi="Montserrat"/>
+          <w:color w:val="ffffff"/>
+          <w:sz w:val="28"/>
+          <w:szCs w:val="28"/>
+        </w:rPr>
+      </w:pPr>
+      <w:r>
+        <w:rPr>
+          <w:rFonts w:ascii="Montserrat" w:cs="Montserrat" w:eastAsia="Montserrat" w:hAnsi="Montserrat"/>
+          <w:color w:val="ffffff"/>
+          <w:sz w:val="28"/>
+          <w:szCs w:val="28"/>
+          <w:rtl w:val="0"/>
+        </w:rPr>
+        <w:t xml:space="preserve">“That’s totally crazy…” he said, his gruff accent leaning into a slight chuckle. “I thought the war was over land, or something…”</w:t>
       </w:r>
     </w:p>
     <w:p>
@@ -2258,70 +2280,75 @@
         </w:rPr>
         <w:t xml:space="preserve">“That one was Kay, actually…” she said. “I don’t think there’s a Gillman’s that man hasn’t read.”</w:t>
         <w:br w:type="textWrapping"/>
-        <w:t xml:space="preserve">He caressed her shoulder with his thick fingers, watching as Bore’Van disappeared from view behind a cluster of rocks.</w:t>
-      </w:r>
-    </w:p>
-    <w:p>
-      <w:pPr>
-        <w:ind w:left="0" w:firstLine="720"/>
-        <w:rPr>
-          <w:rFonts w:ascii="Montserrat" w:cs="Montserrat" w:eastAsia="Montserrat" w:hAnsi="Montserrat"/>
-          <w:color w:val="ffffff"/>
-          <w:sz w:val="28"/>
-          <w:szCs w:val="28"/>
-        </w:rPr>
-      </w:pPr>
-      <w:r>
-        <w:rPr>
-          <w:rFonts w:ascii="Montserrat" w:cs="Montserrat" w:eastAsia="Montserrat" w:hAnsi="Montserrat"/>
-          <w:color w:val="ffffff"/>
-          <w:sz w:val="28"/>
-          <w:szCs w:val="28"/>
-          <w:rtl w:val="0"/>
-        </w:rPr>
-        <w:t xml:space="preserve">“We have a good chance to succeed,” he said, very quietly, as if to announce it would be a sinful curse. “We’ll take it. We’ll see him again.”</w:t>
-      </w:r>
-    </w:p>
-    <w:p>
-      <w:pPr>
-        <w:ind w:left="0" w:firstLine="720"/>
-        <w:rPr>
-          <w:rFonts w:ascii="Montserrat" w:cs="Montserrat" w:eastAsia="Montserrat" w:hAnsi="Montserrat"/>
-          <w:color w:val="ffffff"/>
-          <w:sz w:val="28"/>
-          <w:szCs w:val="28"/>
-        </w:rPr>
-      </w:pPr>
-      <w:r>
-        <w:rPr>
-          <w:rFonts w:ascii="Montserrat" w:cs="Montserrat" w:eastAsia="Montserrat" w:hAnsi="Montserrat"/>
-          <w:color w:val="ffffff"/>
-          <w:sz w:val="28"/>
-          <w:szCs w:val="28"/>
-          <w:rtl w:val="0"/>
-        </w:rPr>
-        <w:t xml:space="preserve">“If we don’t…?” she said, turning her head to lean over him and see Verne and Lovatt climbing aboard the Sorceress to make their preparations in the last of the evening’s light. “Or if he’s gone?”</w:t>
-      </w:r>
-    </w:p>
-    <w:p>
-      <w:pPr>
-        <w:ind w:left="0" w:firstLine="720"/>
-        <w:rPr>
-          <w:rFonts w:ascii="Montserrat" w:cs="Montserrat" w:eastAsia="Montserrat" w:hAnsi="Montserrat"/>
-          <w:color w:val="ffffff"/>
-          <w:sz w:val="28"/>
-          <w:szCs w:val="28"/>
-        </w:rPr>
-      </w:pPr>
-      <w:r>
-        <w:rPr>
-          <w:rFonts w:ascii="Montserrat" w:cs="Montserrat" w:eastAsia="Montserrat" w:hAnsi="Montserrat"/>
-          <w:color w:val="ffffff"/>
-          <w:sz w:val="28"/>
-          <w:szCs w:val="28"/>
-          <w:rtl w:val="0"/>
-        </w:rPr>
-        <w:t xml:space="preserve">“We will. And if he’s gone, we’ll find him,” he said back, his voice reverberating through his chest to shudder her shoulder. “I promise. Now, come on, time to ship out.”</w:t>
+        <w:t xml:space="preserve">He caressed her shoulder with his thick fingers, watching as Bore’Van climbed awkwardly aboard the Sorceress, his bag weighing him down as he poised himself on a folding chair, one arm gripping the boat’s railing.</w:t>
+      </w:r>
+    </w:p>
+    <w:p>
+      <w:pPr>
+        <w:ind w:left="0" w:firstLine="720"/>
+        <w:rPr>
+          <w:rFonts w:ascii="Montserrat" w:cs="Montserrat" w:eastAsia="Montserrat" w:hAnsi="Montserrat"/>
+          <w:color w:val="ffffff"/>
+          <w:sz w:val="28"/>
+          <w:szCs w:val="28"/>
+        </w:rPr>
+      </w:pPr>
+      <w:r>
+        <w:rPr>
+          <w:rFonts w:ascii="Montserrat" w:cs="Montserrat" w:eastAsia="Montserrat" w:hAnsi="Montserrat"/>
+          <w:color w:val="ffffff"/>
+          <w:sz w:val="28"/>
+          <w:szCs w:val="28"/>
+          <w:rtl w:val="0"/>
+        </w:rPr>
+        <w:t xml:space="preserve">“We have a good chance to succeed,” he said, very quietly, as if to announce it would be a sinful curse. He watched Lovatt emerge and pull the bag from Bore’Van’s hand, pulling the man to land on the deck. “We’ll take it. We’ll see him again.”</w:t>
+      </w:r>
+    </w:p>
+    <w:p>
+      <w:pPr>
+        <w:ind w:left="0" w:firstLine="720"/>
+        <w:rPr>
+          <w:rFonts w:ascii="Montserrat" w:cs="Montserrat" w:eastAsia="Montserrat" w:hAnsi="Montserrat"/>
+          <w:color w:val="ffffff"/>
+          <w:sz w:val="28"/>
+          <w:szCs w:val="28"/>
+        </w:rPr>
+      </w:pPr>
+      <w:r>
+        <w:rPr>
+          <w:rFonts w:ascii="Montserrat" w:cs="Montserrat" w:eastAsia="Montserrat" w:hAnsi="Montserrat"/>
+          <w:color w:val="ffffff"/>
+          <w:sz w:val="28"/>
+          <w:szCs w:val="28"/>
+          <w:rtl w:val="0"/>
+        </w:rPr>
+        <w:t xml:space="preserve">“If we don’t…?” she said, turning her head to lean over him and see Verne finally finish his rolled tobacco, throwing the last of it into the water and climbing aboard. Soft lights suddenly brightened the brine to a glisten ahead of the boat’s sharply pointed nose, her engine activating and rippling through the bay. “Or if he’s gone?”</w:t>
+      </w:r>
+    </w:p>
+    <w:p>
+      <w:pPr>
+        <w:ind w:left="0" w:firstLine="720"/>
+        <w:rPr>
+          <w:rFonts w:ascii="Montserrat" w:cs="Montserrat" w:eastAsia="Montserrat" w:hAnsi="Montserrat"/>
+          <w:color w:val="ffffff"/>
+          <w:sz w:val="28"/>
+          <w:szCs w:val="28"/>
+        </w:rPr>
+      </w:pPr>
+      <w:r>
+        <w:rPr>
+          <w:rFonts w:ascii="Montserrat" w:cs="Montserrat" w:eastAsia="Montserrat" w:hAnsi="Montserrat"/>
+          <w:color w:val="ffffff"/>
+          <w:sz w:val="28"/>
+          <w:szCs w:val="28"/>
+          <w:rtl w:val="0"/>
+        </w:rPr>
+        <w:t xml:space="preserve">“We will. And if he’s not there, we’ll find him,” he said back, his voice reverberating through his chest to shudder her shoulder. “I promise. Now, come on, we’re out of time. Gotta drop off the dead weight at Pallmot’s Neck, then we’ll have to head straight for Balliway. Are you ready?”</w:t>
+        <w:br w:type="textWrapping"/>
+        <w:t xml:space="preserve">She nodded, closing her eyes as he broke his embrace with her and clapped his hans to rub them together. </w:t>
+        <w:br w:type="textWrapping"/>
+        <w:tab/>
+        <w:t xml:space="preserve">“We’re gonna do this…” she whispered, and tred her best to believe it.</w:t>
       </w:r>
     </w:p>
     <w:sectPr>

</xml_diff>